<commit_message>
dataset für GS und Lieferschein
</commit_message>
<xml_diff>
--- a/ForNav/Layouts/lbtSalesTemplate.docx
+++ b/ForNav/Layouts/lbtSalesTemplate.docx
@@ -30,9 +30,9 @@
  
          < l b t H e a d e r T e x t > l b t H e a d e r T e x t < / l b t H e a d e r T e x t >   
+         < R e p o r t F o r N a v I d _ 2 > R e p o r t F o r N a v I d _ 2 < / R e p o r t F o r N a v I d _ 2 > + 
          < R e p o r t F o r N a v _ H e a d e r > R e p o r t F o r N a v _ H e a d e r < / R e p o r t F o r N a v _ H e a d e r > - 
-         < R e p o r t F o r N a v I d _ 2 > R e p o r t F o r N a v I d _ 2 < / R e p o r t F o r N a v I d _ 2 >   
          < S i n g l e V A T P c t > S i n g l e V A T P c t < / S i n g l e V A T P c t >   
@@ -40,33 +40,33 @@
  
              < l b t L i n e T e x t > l b t L i n e T e x t < / l b t L i n e T e x t >   
+             < R e p o r t F o r N a v I d _ 3 > R e p o r t F o r N a v I d _ 3 < / R e p o r t F o r N a v I d _ 3 > + 
              < R e p o r t F o r N a v _ L i n e > R e p o r t F o r N a v _ L i n e < / R e p o r t F o r N a v _ L i n e > - 
-             < R e p o r t F o r N a v I d _ 3 > R e p o r t F o r N a v I d _ 3 < / R e p o r t F o r N a v I d _ 3 >   
          < / L i n e >   
          < V A T A m o u n t L i n e >   
+             < R e p o r t F o r N a v I d _ 1 0 0 0 0 0 0 0 0 1 > R e p o r t F o r N a v I d _ 1 0 0 0 0 0 0 0 0 1 < / R e p o r t F o r N a v I d _ 1 0 0 0 0 0 0 0 0 1 > + 
              < R e p o r t F o r N a v _ V A T A m o u n t L i n e > R e p o r t F o r N a v _ V A T A m o u n t L i n e < / R e p o r t F o r N a v _ V A T A m o u n t L i n e > - 
-             < R e p o r t F o r N a v I d _ 1 0 0 0 0 0 0 0 0 1 > R e p o r t F o r N a v I d _ 1 0 0 0 0 0 0 0 0 1 < / R e p o r t F o r N a v I d _ 1 0 0 0 0 0 0 0 0 1 >   
          < / V A T A m o u n t L i n e >   
          < V A T C l a u s e >   
+             < R e p o r t F o r N a v I d _ 1 0 0 0 0 0 0 0 0 2 > R e p o r t F o r N a v I d _ 1 0 0 0 0 0 0 0 0 2 < / R e p o r t F o r N a v I d _ 1 0 0 0 0 0 0 0 0 2 > + 
              < R e p o r t F o r N a v _ V A T C l a u s e > R e p o r t F o r N a v _ V A T C l a u s e < / R e p o r t F o r N a v _ V A T C l a u s e > - 
-             < R e p o r t F o r N a v I d _ 1 0 0 0 0 0 0 0 0 2 > R e p o r t F o r N a v I d _ 1 0 0 0 0 0 0 0 0 2 < / R e p o r t F o r N a v I d _ 1 0 0 0 0 0 0 0 0 2 >   
          < / V A T C l a u s e >   
          < I n t e g e r >   
+             < R e p o r t F o r N a v I d _ 1 0 0 0 0 0 0 0 0 3 > R e p o r t F o r N a v I d _ 1 0 0 0 0 0 0 0 0 3 < / R e p o r t F o r N a v I d _ 1 0 0 0 0 0 0 0 0 3 > + 
              < R e p o r t F o r N a v _ I n t e g e r > R e p o r t F o r N a v _ I n t e g e r < / R e p o r t F o r N a v _ I n t e g e r > - 
-             < R e p o r t F o r N a v I d _ 1 0 0 0 0 0 0 0 0 3 > R e p o r t F o r N a v I d _ 1 0 0 0 0 0 0 0 0 3 < / R e p o r t F o r N a v I d _ 1 0 0 0 0 0 0 0 0 3 >   
          < / I n t e g e r >   

</xml_diff>

<commit_message>
H23/0152 Reportextension Purch Order, Korrekturen Purch Template
</commit_message>
<xml_diff>
--- a/ForNav/Layouts/lbtSalesTemplate.docx
+++ b/ForNav/Layouts/lbtSalesTemplate.docx
@@ -30,9 +30,9 @@
  
          < l b t H e a d e r T e x t > l b t H e a d e r T e x t < / l b t H e a d e r T e x t >   
+         < R e p o r t F o r N a v I d _ 2 > R e p o r t F o r N a v I d _ 2 < / R e p o r t F o r N a v I d _ 2 > + 
          < R e p o r t F o r N a v _ H e a d e r > R e p o r t F o r N a v _ H e a d e r < / R e p o r t F o r N a v _ H e a d e r > - 
-         < R e p o r t F o r N a v I d _ 2 > R e p o r t F o r N a v I d _ 2 < / R e p o r t F o r N a v I d _ 2 >   
          < S i n g l e V A T P c t > S i n g l e V A T P c t < / S i n g l e V A T P c t >   
@@ -40,33 +40,33 @@
  
              < l b t L i n e T e x t > l b t L i n e T e x t < / l b t L i n e T e x t >   
+             < R e p o r t F o r N a v I d _ 3 > R e p o r t F o r N a v I d _ 3 < / R e p o r t F o r N a v I d _ 3 > + 
              < R e p o r t F o r N a v _ L i n e > R e p o r t F o r N a v _ L i n e < / R e p o r t F o r N a v _ L i n e > - 
-             < R e p o r t F o r N a v I d _ 3 > R e p o r t F o r N a v I d _ 3 < / R e p o r t F o r N a v I d _ 3 >   
          < / L i n e >   
          < V A T A m o u n t L i n e >   
+             < R e p o r t F o r N a v I d _ 1 0 0 0 0 0 0 0 0 1 > R e p o r t F o r N a v I d _ 1 0 0 0 0 0 0 0 0 1 < / R e p o r t F o r N a v I d _ 1 0 0 0 0 0 0 0 0 1 > + 
              < R e p o r t F o r N a v _ V A T A m o u n t L i n e > R e p o r t F o r N a v _ V A T A m o u n t L i n e < / R e p o r t F o r N a v _ V A T A m o u n t L i n e > - 
-             < R e p o r t F o r N a v I d _ 1 0 0 0 0 0 0 0 0 1 > R e p o r t F o r N a v I d _ 1 0 0 0 0 0 0 0 0 1 < / R e p o r t F o r N a v I d _ 1 0 0 0 0 0 0 0 0 1 >   
          < / V A T A m o u n t L i n e >   
          < V A T C l a u s e >   
+             < R e p o r t F o r N a v I d _ 1 0 0 0 0 0 0 0 0 2 > R e p o r t F o r N a v I d _ 1 0 0 0 0 0 0 0 0 2 < / R e p o r t F o r N a v I d _ 1 0 0 0 0 0 0 0 0 2 > + 
              < R e p o r t F o r N a v _ V A T C l a u s e > R e p o r t F o r N a v _ V A T C l a u s e < / R e p o r t F o r N a v _ V A T C l a u s e > - 
-             < R e p o r t F o r N a v I d _ 1 0 0 0 0 0 0 0 0 2 > R e p o r t F o r N a v I d _ 1 0 0 0 0 0 0 0 0 2 < / R e p o r t F o r N a v I d _ 1 0 0 0 0 0 0 0 0 2 >   
          < / V A T C l a u s e >   
          < I n t e g e r >   
+             < R e p o r t F o r N a v I d _ 1 0 0 0 0 0 0 0 0 3 > R e p o r t F o r N a v I d _ 1 0 0 0 0 0 0 0 0 3 < / R e p o r t F o r N a v I d _ 1 0 0 0 0 0 0 0 0 3 > + 
              < R e p o r t F o r N a v _ I n t e g e r > R e p o r t F o r N a v _ I n t e g e r < / R e p o r t F o r N a v _ I n t e g e r > - 
-             < R e p o r t F o r N a v I d _ 1 0 0 0 0 0 0 0 0 3 > R e p o r t F o r N a v I d _ 1 0 0 0 0 0 0 0 0 3 < / R e p o r t F o r N a v I d _ 1 0 0 0 0 0 0 0 0 3 >   
          < / I n t e g e r >   

</xml_diff>